<commit_message>
Apply user note merges to event report, extended report and brief
Co-Authored-By: Claude Fable 5.1 <noreply@anthropic.com>
Claude-Session: https://claude.ai/code/session_01L8aigT8rcgficjTBusL67d
</commit_message>
<xml_diff>
--- a/mof-insurer-injection-2026-09/extended/brief_extended.docx
+++ b/mof-insurer-injection-2026-09/extended/brief_extended.docx
@@ -97,7 +97,7 @@
         <w:t>最接近真缺口</w:t>
       </w:r>
       <w:r>
-        <w:t>。太平人壽核心兩季從 155.6% 掉到 133.5%；2022 年末核心曾只有 96.8%；2023 年財政部已增資 25 億；惠譽 2025 年初對集團展望負面。</w:t>
+        <w:t>。集團 2025 年末約 146%／222%，兩年掉 10／48 個百分點；太平人壽核心兩季從 155.6% 掉到 133.5%；2022 年末核心曾只有 96.8%；2023 年財政部已增資 25 億；惠譽 2025 年初對集團展望負面。</w:t>
       </w:r>
     </w:p>
     <w:p>
@@ -131,7 +131,7 @@
         <w:t>政策任務</w:t>
       </w:r>
       <w:r>
-        <w:t>。6 月註冊資本剛從 271.6 億增至 461.25 億，9 月再加 100 億，合計近 290 億對應外貿承保擴容。償付能力數字完全未揭露。</w:t>
+        <w:t>。6 月註冊資本剛從 271.6 億增至 461.25 億，9 月再加 100 億（推算至 561.25 億），合計近 290 億對應外貿承保擴容。償付能力數字完全未揭露。</w:t>
       </w:r>
     </w:p>
     <w:p>

</xml_diff>

<commit_message>
Apply Taiping primary-source updates to markdown reports
Co-Authored-By: Claude Fable 5.1 <noreply@anthropic.com>
Claude-Session: https://claude.ai/code/session_01L8aigT8rcgficjTBusL67d
</commit_message>
<xml_diff>
--- a/mof-insurer-injection-2026-09/extended/brief_extended.docx
+++ b/mof-insurer-injection-2026-09/extended/brief_extended.docx
@@ -94,10 +94,10 @@
         <w:rPr>
           <w:b/>
         </w:rPr>
-        <w:t>最接近真缺口</w:t>
+        <w:t>最接近真缺口，且有原文證實</w:t>
       </w:r>
       <w:r>
-        <w:t>。集團 2025 年末約 146%／222%，兩年掉 10／48 個百分點；太平人壽核心兩季從 155.6% 掉到 133.5%；2022 年末核心曾只有 96.8%；2023 年財政部已增資 25 億；惠譽 2025 年初對集團展望負面。</w:t>
+        <w:t>。集團 2025 年末 146%／222%，一年掉 32／49 個百分點（實際資本 −252 億、核心 −155 億、最低資本 +164 億）；太平人壽 2026Q1 核心 133.5%，公司自估 2026Q2 降到 112.25%；保單未來盈餘計入核心資本已頂到上限；2022 年末核心曾只有 96.8%；2023 年財政部已增資 25 億；惠譽對集團展望負面。</w:t>
       </w:r>
     </w:p>
     <w:p>
@@ -551,7 +551,7 @@
               <w:rPr>
                 <w:sz w:val="18"/>
               </w:rPr>
-              <w:t>太平人壽</w:t>
+              <w:t>太平集團（原文）</w:t>
             </w:r>
           </w:p>
         </w:tc>
@@ -587,7 +587,7 @@
               <w:rPr>
                 <w:sz w:val="18"/>
               </w:rPr>
-              <w:t>≈1,146 億</w:t>
+              <w:t>1,401 億</w:t>
             </w:r>
           </w:p>
         </w:tc>
@@ -605,7 +605,117 @@
               <w:rPr>
                 <w:sz w:val="18"/>
               </w:rPr>
-              <w:t>+6.1 個百分點</w:t>
+              <w:t>+5.0 個百分點</w:t>
+            </w:r>
+          </w:p>
+        </w:tc>
+        <w:tc>
+          <w:tcPr>
+            <w:tcW w:type="dxa" w:w="1662"/>
+          </w:tcPr>
+          <w:p>
+            <w:r>
+              <w:rPr>
+                <w:sz w:val="18"/>
+              </w:rPr>
+            </w:r>
+            <w:r>
+              <w:rPr>
+                <w:sz w:val="18"/>
+              </w:rPr>
+              <w:t>1.7 倍</w:t>
+            </w:r>
+          </w:p>
+        </w:tc>
+        <w:tc>
+          <w:tcPr>
+            <w:tcW w:type="dxa" w:w="1662"/>
+          </w:tcPr>
+          <w:p>
+            <w:r>
+              <w:rPr>
+                <w:sz w:val="18"/>
+              </w:rPr>
+            </w:r>
+            <w:r>
+              <w:rPr>
+                <w:sz w:val="18"/>
+              </w:rPr>
+              <w:t>0.35 倍</w:t>
+            </w:r>
+          </w:p>
+        </w:tc>
+      </w:tr>
+      <w:tr>
+        <w:tc>
+          <w:tcPr>
+            <w:tcW w:type="dxa" w:w="1662"/>
+          </w:tcPr>
+          <w:p>
+            <w:r>
+              <w:rPr>
+                <w:sz w:val="18"/>
+              </w:rPr>
+            </w:r>
+            <w:r>
+              <w:rPr>
+                <w:sz w:val="18"/>
+              </w:rPr>
+              <w:t>太平人壽（原文，假設全額下沉）</w:t>
+            </w:r>
+          </w:p>
+        </w:tc>
+        <w:tc>
+          <w:tcPr>
+            <w:tcW w:type="dxa" w:w="1662"/>
+          </w:tcPr>
+          <w:p>
+            <w:r>
+              <w:rPr>
+                <w:sz w:val="18"/>
+              </w:rPr>
+            </w:r>
+            <w:r>
+              <w:rPr>
+                <w:sz w:val="18"/>
+              </w:rPr>
+              <w:t>70 億</w:t>
+            </w:r>
+          </w:p>
+        </w:tc>
+        <w:tc>
+          <w:tcPr>
+            <w:tcW w:type="dxa" w:w="1662"/>
+          </w:tcPr>
+          <w:p>
+            <w:r>
+              <w:rPr>
+                <w:sz w:val="18"/>
+              </w:rPr>
+            </w:r>
+            <w:r>
+              <w:rPr>
+                <w:sz w:val="18"/>
+              </w:rPr>
+              <w:t>1,166 億</w:t>
+            </w:r>
+          </w:p>
+        </w:tc>
+        <w:tc>
+          <w:tcPr>
+            <w:tcW w:type="dxa" w:w="1662"/>
+          </w:tcPr>
+          <w:p>
+            <w:r>
+              <w:rPr>
+                <w:sz w:val="18"/>
+              </w:rPr>
+            </w:r>
+            <w:r>
+              <w:rPr>
+                <w:sz w:val="18"/>
+              </w:rPr>
+              <w:t>+6.0（含盈餘上限乘數約 +9～10）</w:t>
             </w:r>
           </w:p>
         </w:tc>
@@ -686,7 +796,7 @@
         <w:t>注資約等於一年的消耗</w:t>
       </w:r>
       <w:r>
-        <w:t>。</w:t>
+        <w:t>；太平集團 2025 年核心溢額流失 237 億，70 億只補三成。</w:t>
       </w:r>
     </w:p>
     <w:p>

</xml_diff>